<commit_message>
Added bootloader slide explanation and Content Update
</commit_message>
<xml_diff>
--- a/Microprocessor/TheoryLectures/Thumb2_16bit_vs_32bit.docx
+++ b/Microprocessor/TheoryLectures/Thumb2_16bit_vs_32bit.docx
@@ -135,7 +135,25 @@
         <w:t xml:space="preserve"> </w:t>
       </w:r>
       <w:r>
-        <w:t>A more general ADD instruction, such as ADD R3, R4, R5. </w:t>
+        <w:t>A more general ADD instruction, such as ADD R</w:t>
+      </w:r>
+      <w:r>
+        <w:t>8</w:t>
+      </w:r>
+      <w:r>
+        <w:t>, R</w:t>
+      </w:r>
+      <w:r>
+        <w:t>9</w:t>
+      </w:r>
+      <w:r>
+        <w:t>, R</w:t>
+      </w:r>
+      <w:r>
+        <w:t>10</w:t>
+      </w:r>
+      <w:r>
+        <w:t>. </w:t>
       </w:r>
     </w:p>
     <w:p>
@@ -160,7 +178,25 @@
         <w:t xml:space="preserve"> </w:t>
       </w:r>
       <w:r>
-        <w:t>This also adds the contents of R4 and R5 and stores the result in R3. </w:t>
+        <w:t>This also adds the contents of R</w:t>
+      </w:r>
+      <w:r>
+        <w:t>9</w:t>
+      </w:r>
+      <w:r>
+        <w:t xml:space="preserve"> and R</w:t>
+      </w:r>
+      <w:r>
+        <w:t>10</w:t>
+      </w:r>
+      <w:r>
+        <w:t xml:space="preserve"> and stores the result in R</w:t>
+      </w:r>
+      <w:r>
+        <w:t>8</w:t>
+      </w:r>
+      <w:r>
+        <w:t>. </w:t>
       </w:r>
     </w:p>
     <w:p>
@@ -315,11 +351,7 @@
         <w:t xml:space="preserve"> </w:t>
       </w:r>
       <w:r>
-        <w:t xml:space="preserve">The choice between a 16-bit or 32-bit version of an instruction depends on the specific instruction and the available operands. For example, </w:t>
-      </w:r>
-      <w:proofErr w:type="gramStart"/>
-      <w:r>
-        <w:t>the </w:t>
+        <w:t>The choice between a 16-bit or 32-bit version of an instruction depends on the specific instruction and the available operands. For example, the </w:t>
       </w:r>
       <w:r>
         <w:rPr>
@@ -327,7 +359,6 @@
         </w:rPr>
         <w:t>.W</w:t>
       </w:r>
-      <w:proofErr w:type="gramEnd"/>
       <w:r>
         <w:t> suffix in some assemblers forces a 32-bit instruction, while the </w:t>
       </w:r>
@@ -1534,6 +1565,7 @@
   <w:style w:type="character" w:default="1" w:styleId="DefaultParagraphFont">
     <w:name w:val="Default Paragraph Font"/>
     <w:uiPriority w:val="1"/>
+    <w:semiHidden/>
     <w:unhideWhenUsed/>
   </w:style>
   <w:style w:type="table" w:default="1" w:styleId="TableNormal">

</xml_diff>